<commit_message>
chore(docs): commit the EXCO guide snapshot as it stands
The dated copy of the EXCO guide had been modified in the working tree
since 14 October and left uncommitted through this session's work, so
every commit since has been made against a tree with one file hanging.

Committed at the user's request, as found. The change is sixteen bytes in
a Word document and I cannot read it: it has the shape of a file opened
and saved rather than edited, but that is an inference from the size, not
something I checked. build.py regenerates exco.docx and not this dated
snapshot, so nothing here was produced by the guide build.

Co-Authored-By: Claude Opus 5 <noreply@anthropic.com>
</commit_message>
<xml_diff>
--- a/docs/guides/exco 13 Oct 2026 4pm.docx
+++ b/docs/guides/exco 13 Oct 2026 4pm.docx
@@ -332,6 +332,9 @@
         <w:t xml:space="preserve"> </w:t>
       </w:r>
       <w:r>
+        <w:rPr>
+          <w:noProof/>
+        </w:rPr>
         <w:drawing>
           <wp:inline distT="0" distB="0" distL="0" distR="0" wp14:anchorId="2EFB2D18" wp14:editId="74FDBEAB">
             <wp:extent cx="2606266" cy="5456393"/>
@@ -657,10 +660,7 @@
         <w:spacing w:after="120" w:line="283" w:lineRule="auto"/>
       </w:pPr>
       <w:r>
-        <w:t>You may also appoint a checker who essentially is a person that can assist you to</w:t>
-      </w:r>
-      <w:r>
-        <w:t xml:space="preserve"> collects the receipts and raises claims</w:t>
+        <w:t>You may also appoint a checker who essentially is a person that can assist you to collects the receipts and raises claims</w:t>
       </w:r>
       <w:r>
         <w:t xml:space="preserve"> on your behalf (i.e. </w:t>
@@ -710,10 +710,7 @@
         <w:spacing w:after="120" w:line="283" w:lineRule="auto"/>
       </w:pPr>
       <w:r>
-        <w:t>Please let the finance executive who may want to appoint as your checker and ask submit his or her email which will be used for login and access purposes. Please also note, that t</w:t>
-      </w:r>
-      <w:r>
-        <w:t>he person you choose must hold no portfolio of their own; the app will not let you appoint somebody who does, because a checker who could also verify would be checking their own work.</w:t>
+        <w:t>Please let the finance executive who may want to appoint as your checker and ask submit his or her email which will be used for login and access purposes. Please also note, that the person you choose must hold no portfolio of their own; the app will not let you appoint somebody who does, because a checker who could also verify would be checking their own work.</w:t>
       </w:r>
     </w:p>
     <w:p>
@@ -1369,16 +1366,7 @@
         <w:t>the claim/payment is for in</w:t>
       </w:r>
       <w:r>
-        <w:t xml:space="preserve"> a few plain words</w:t>
-      </w:r>
-      <w:r>
-        <w:t xml:space="preserve"> (e.g.</w:t>
-      </w:r>
-      <w:r>
-        <w:t xml:space="preserve"> “Petrol, Orang Asli outreach, 12–14 Sept”</w:t>
-      </w:r>
-      <w:r>
-        <w:t>)</w:t>
+        <w:t xml:space="preserve"> a few plain words (e.g. “Petrol, Orang Asli outreach, 12–14 Sept”)</w:t>
       </w:r>
     </w:p>
     <w:p>
@@ -1458,7 +1446,19 @@
         <w:rPr>
           <w:bCs/>
         </w:rPr>
+        <w:t xml:space="preserve">to </w:t>
+      </w:r>
+      <w:r>
+        <w:rPr>
+          <w:bCs/>
+        </w:rPr>
         <w:t xml:space="preserve">decide </w:t>
+      </w:r>
+      <w:r>
+        <w:rPr>
+          <w:bCs/>
+        </w:rPr>
+        <w:t xml:space="preserve">the </w:t>
       </w:r>
       <w:r>
         <w:rPr>
@@ -1487,24 +1487,13 @@
         <w:t xml:space="preserve"> Pay, Cheque, etc.)</w:t>
       </w:r>
       <w:r>
-        <w:t xml:space="preserve">. Upon </w:t>
-      </w:r>
-      <w:proofErr w:type="gramStart"/>
-      <w:r>
-        <w:t>selecting</w:t>
-      </w:r>
-      <w:proofErr w:type="gramEnd"/>
-      <w:r>
-        <w:t xml:space="preserve"> please </w:t>
-      </w:r>
-      <w:r>
-        <w:t>check the account number twice</w:t>
-      </w:r>
-      <w:r>
-        <w:t xml:space="preserve"> for verification before submitting</w:t>
-      </w:r>
-      <w:r>
-        <w:t>.</w:t>
+        <w:t>. Upon selecting</w:t>
+      </w:r>
+      <w:r>
+        <w:t>,</w:t>
+      </w:r>
+      <w:r>
+        <w:t xml:space="preserve"> please check the account number twice for verification before submitting.</w:t>
       </w:r>
     </w:p>
     <w:p>
@@ -1534,22 +1523,10 @@
         <w:rPr>
           <w:b/>
         </w:rPr>
-        <w:t xml:space="preserve"> </w:t>
-      </w:r>
-      <w:r>
-        <w:rPr>
-          <w:b/>
-        </w:rPr>
-        <w:t xml:space="preserve">Application Signature </w:t>
-      </w:r>
-      <w:r>
-        <w:t>box wi</w:t>
-      </w:r>
-      <w:r>
-        <w:t>th your finger or your mouse, an</w:t>
-      </w:r>
-      <w:r>
-        <w:t xml:space="preserve">d then hit the </w:t>
+        <w:t xml:space="preserve"> Application Signature </w:t>
+      </w:r>
+      <w:r>
+        <w:t xml:space="preserve">box with your finger or your mouse, and then hit the </w:t>
       </w:r>
       <w:r>
         <w:rPr>
@@ -1614,6 +1591,9 @@
         <w:jc w:val="center"/>
       </w:pPr>
       <w:r>
+        <w:rPr>
+          <w:noProof/>
+        </w:rPr>
         <w:lastRenderedPageBreak/>
         <w:drawing>
           <wp:inline distT="0" distB="0" distL="0" distR="0" wp14:anchorId="57BC4BEF" wp14:editId="17908265">
@@ -1874,7 +1854,19 @@
               <w:rPr>
                 <w:sz w:val="20"/>
               </w:rPr>
-              <w:t>Inform the Finance Executive</w:t>
+              <w:t xml:space="preserve">Inform the </w:t>
+            </w:r>
+            <w:r>
+              <w:rPr>
+                <w:sz w:val="20"/>
+              </w:rPr>
+              <w:t>Admin</w:t>
+            </w:r>
+            <w:r>
+              <w:rPr>
+                <w:sz w:val="20"/>
+              </w:rPr>
+              <w:t xml:space="preserve"> Executive</w:t>
             </w:r>
             <w:r>
               <w:rPr>
@@ -2128,28 +2120,21 @@
           <w:color w:val="000000" w:themeColor="text1"/>
           <w:sz w:val="18"/>
         </w:rPr>
-        <w:t xml:space="preserve">13 Oct 2026 </w:t>
+        <w:t>Oct</w:t>
       </w:r>
       <w:r>
         <w:rPr>
           <w:color w:val="000000" w:themeColor="text1"/>
           <w:sz w:val="18"/>
         </w:rPr>
-        <w:t>–</w:t>
+        <w:t>ober</w:t>
       </w:r>
       <w:r>
         <w:rPr>
           <w:color w:val="000000" w:themeColor="text1"/>
           <w:sz w:val="18"/>
         </w:rPr>
-        <w:t xml:space="preserve"> </w:t>
-      </w:r>
-      <w:r>
-        <w:rPr>
-          <w:color w:val="000000" w:themeColor="text1"/>
-          <w:sz w:val="18"/>
-        </w:rPr>
-        <w:t>4pm</w:t>
+        <w:t xml:space="preserve"> 2026</w:t>
       </w:r>
     </w:p>
     <w:sectPr>

</xml_diff>